<commit_message>
Support native 18.4.2 and verify Jev browser completion
</commit_message>
<xml_diff>
--- a/docs/Kiln-User-Manual.docx
+++ b/docs/Kiln-User-Manual.docx
@@ -136,17 +136,17 @@
         <w:t>--home DIR</w:t>
       </w:r>
       <w:r>
-        <w:t xml:space="preserve"> command flag selects a different home. Run artifacts, credential storage and the working repository are separate: a task's </w:t>
+        <w:t xml:space="preserve"> command flag selects a different home. Use </w:t>
       </w:r>
       <w:r>
         <w:rPr>
           <w:rFonts w:ascii="Courier New" w:hAnsi="Courier New"/>
           <w:sz w:val="18"/>
         </w:rPr>
-        <w:t>--cwd</w:t>
-      </w:r>
-      <w:r>
-        <w:t xml:space="preserve"> identifies the repository it works on.</w:t>
+        <w:t>--cwd DIR</w:t>
+      </w:r>
+      <w:r>
+        <w:t xml:space="preserve"> to select the working repository separately from run artifacts and credential storage.</w:t>
       </w:r>
     </w:p>
     <w:p>
@@ -904,7 +904,37 @@
         <w:t>task</w:t>
       </w:r>
       <w:r>
-        <w:t xml:space="preserve"> starts workers and </w:t>
+        <w:t xml:space="preserve"> starts workers. In native runtime 18.4.2, agents send peer messages through </w:t>
+      </w:r>
+      <w:r>
+        <w:rPr>
+          <w:rFonts w:ascii="Courier New" w:hAnsi="Courier New"/>
+          <w:sz w:val="18"/>
+        </w:rPr>
+        <w:t>write</w:t>
+      </w:r>
+      <w:r>
+        <w:t xml:space="preserve"> to </w:t>
+      </w:r>
+      <w:r>
+        <w:rPr>
+          <w:rFonts w:ascii="Courier New" w:hAnsi="Courier New"/>
+          <w:sz w:val="18"/>
+        </w:rPr>
+        <w:t>agent://&lt;id&gt;</w:t>
+      </w:r>
+      <w:r>
+        <w:t xml:space="preserve">. Results and messages arrive automatically; </w:t>
+      </w:r>
+      <w:r>
+        <w:rPr>
+          <w:rFonts w:ascii="Courier New" w:hAnsi="Courier New"/>
+          <w:sz w:val="18"/>
+        </w:rPr>
+        <w:t>wait</w:t>
+      </w:r>
+      <w:r>
+        <w:t xml:space="preserve"> is available when blocked on an owned job or message. The removed </w:t>
       </w:r>
       <w:r>
         <w:rPr>
@@ -914,7 +944,7 @@
         <w:t>hub</w:t>
       </w:r>
       <w:r>
-        <w:t xml:space="preserve"> coordinates them. The parent defines each feature's objective, literal relative file or directory scopes, dependencies and acceptance criteria. Workers query the latest revision, claim a ready feature, work in their assigned scope and return artifact hashes plus check reports. Stale revisions, overlapping active scopes and unmet dependencies are rejected.</w:t>
+        <w:t xml:space="preserve"> tool is not part of this runtime. The parent defines each feature's objective, literal relative file or directory scopes, dependencies and acceptance criteria. Workers query the latest revision, claim a ready feature, work in their assigned scope and return artifact hashes plus check reports. Stale revisions, overlapping active scopes and unmet dependencies are rejected.</w:t>
       </w:r>
     </w:p>
     <w:p>
@@ -1090,7 +1120,17 @@
     </w:p>
     <w:p>
       <w:r>
-        <w:t>Adaptive routing filters candidates through configured access and compatibility, then uses the available role evidence. A benchmark snapshot has a source and date; it is not live proof that a model is best for your task. An explicit benchmark import requires a reviewed snapshot and does not independently verify its claims.</w:t>
+        <w:t xml:space="preserve">Adaptive routing filters candidates through configured access and compatibility, then uses the available role evidence. A benchmark snapshot has a source and date; it is not live proof that a model is best for your task. Fresh default Codex role candidates now include GPT-6 Astra for critic/judge and GPT-5.5 as a retrieval/probe/arbiter fallback when the smaller model is absent. A compatible fallback can cost more, so inspect </w:t>
+      </w:r>
+      <w:r>
+        <w:rPr>
+          <w:rFonts w:ascii="Courier New" w:hAnsi="Courier New"/>
+          <w:sz w:val="18"/>
+        </w:rPr>
+        <w:t>kiln model roles --json</w:t>
+      </w:r>
+      <w:r>
+        <w:t xml:space="preserve"> and keep an appropriate run budget. Explicit pinned choices are not silently replaced when unavailable. An explicit benchmark import requires a reviewed snapshot and does not independently verify its claims.</w:t>
       </w:r>
     </w:p>
     <w:p>
@@ -1339,7 +1379,7 @@
         <w:t>eval</w:t>
       </w:r>
       <w:r>
-        <w:t>, supplying exact allowed action labels, literal field values and fresh checks. Supported actions are click, fill, select, scroll and wait. It runs at most eight decisions over 30 seconds, returning when done, unsupported, stale, ambiguous or interrupted. It does not open a second browser. Uncertain inputs are not automatically repeated. A stale target can be reobserved within the same limits only when the executor proves no input occurred; completion checks and their observation are captured together.</w:t>
+        <w:t>, supplying exact allowed action labels, literal field values and fresh checks. Supported actions are click, fill, select, scroll and wait. It runs at most eight decisions over 30 seconds, returning when done, unsupported, stale, ambiguous or interrupted. It does not open a second browser. Uncertain inputs are not automatically repeated. A stale target can be reobserved within the same limits only when the executor proves no input occurred; completion checks and their observation are captured together. Already-satisfied literal fills are omitted from fresh actions, and code confirms satisfied primitive checks without requiring another model verdict.</w:t>
       </w:r>
     </w:p>
     <w:p>
@@ -1399,9 +1439,20 @@
     </w:p>
     <w:p>
       <w:r>
-        <w:t xml:space="preserve">Kiln now vendors the pinned jev-ultrafast snapshot and adapts its operation/target decisions to the native browser. It does not run the separate Python agent or launch another Chrome process. Supported browser observations and research passages are sent to TypeSafe for classification. These workflows remain experimental: live performance was not measured because no TypeSafe key was configured. See </w:t>
+        <w:t xml:space="preserve">Kiln now vendors the pinned jev-ultrafast snapshot and adapts its operation/target decisions to the native browser. It does not run the separate Python agent or launch another Chrome process. Supported browser observations and research passages are sent to TypeSafe for classification. These workflows remain experimental. A </w:t>
       </w:r>
       <w:hyperlink r:id="rId11">
+        <w:r>
+          <w:rPr>
+            <w:color w:val="1155AA"/>
+          </w:rPr>
+          <w:t>live qualification</w:t>
+        </w:r>
+      </w:hyperlink>
+      <w:r>
+        <w:t xml:space="preserve"> passed three synthetic fixtures using nine provider requests; it demonstrated batching and request reuse. A subsequent native form fixture completed in two Jev decisions after five incomplete calibration attempts. These are development checks, not representative accuracy or a frontier-model speedup. See </w:t>
+      </w:r>
+      <w:hyperlink r:id="rId12">
         <w:r>
           <w:rPr>
             <w:color w:val="1155AA"/>
@@ -1491,7 +1542,7 @@
       <w:r>
         <w:t xml:space="preserve"> is environment-only. Full bounds and examples are in </w:t>
       </w:r>
-      <w:hyperlink r:id="rId11">
+      <w:hyperlink r:id="rId12">
         <w:r>
           <w:rPr>
             <w:color w:val="1155AA"/>
@@ -1545,7 +1596,7 @@
       <w:r>
         <w:t xml:space="preserve">The </w:t>
       </w:r>
-      <w:hyperlink r:id="rId12">
+      <w:hyperlink r:id="rId13">
         <w:r>
           <w:rPr>
             <w:color w:val="1155AA"/>
@@ -1556,7 +1607,7 @@
       <w:r>
         <w:t xml:space="preserve"> prepares validated, exact-pin dependency changes as draft pull requests for review. It is not operational merely because its files exist: it must be merged and enabled in GitHub Actions. It does not auto-merge or hot-swap running sessions. Patches, type checking, tests, evaluation verification and leak checks must survive the proposed update. Review before merging, and restart using the validated installation. See </w:t>
       </w:r>
-      <w:hyperlink r:id="rId13">
+      <w:hyperlink r:id="rId14">
         <w:r>
           <w:rPr>
             <w:color w:val="1155AA"/>
@@ -1585,7 +1636,7 @@
       <w:r>
         <w:t xml:space="preserve">The current toolkit is detailed in </w:t>
       </w:r>
-      <w:hyperlink r:id="rId14">
+      <w:hyperlink r:id="rId15">
         <w:r>
           <w:rPr>
             <w:color w:val="1155AA"/>
@@ -1643,7 +1694,7 @@
       <w:r>
         <w:t xml:space="preserve">. This document distinguishes installed runtime behavior from design inspiration and pending operational qualification. For commands and daily use, see the </w:t>
       </w:r>
-      <w:hyperlink r:id="rId15">
+      <w:hyperlink r:id="rId16">
         <w:r>
           <w:rPr>
             <w:color w:val="1155AA"/>
@@ -1708,36 +1759,126 @@
     </w:p>
     <w:p>
       <w:r>
-        <w:t xml:space="preserve">A provider-free audit instantiated both </w:t>
+        <w:t xml:space="preserve">A provider-free native-session fixture on pinned runtime </w:t>
+      </w:r>
+      <w:r>
+        <w:rPr>
+          <w:b/>
+        </w:rPr>
+        <w:t>18.4.2</w:t>
+      </w:r>
+      <w:r>
+        <w:t xml:space="preserve"> confirmed eleven root tools: </w:t>
       </w:r>
       <w:r>
         <w:rPr>
           <w:rFonts w:ascii="Courier New" w:hAnsi="Courier New"/>
           <w:sz w:val="18"/>
         </w:rPr>
-        <w:t>createOmpSession</w:t>
-      </w:r>
-      <w:r>
-        <w:t xml:space="preserve"> and the full </w:t>
+        <w:t>read</w:t>
+      </w:r>
+      <w:r>
+        <w:t xml:space="preserve">, </w:t>
       </w:r>
       <w:r>
         <w:rPr>
           <w:rFonts w:ascii="Courier New" w:hAnsi="Courier New"/>
           <w:sz w:val="18"/>
         </w:rPr>
-        <w:t>createOperatorRuntime</w:t>
-      </w:r>
-      <w:r>
-        <w:t xml:space="preserve"> with a synthetic model in a temporary home. With experimental workflows disabled, it confirmed the following </w:t>
+        <w:t>bash</w:t>
+      </w:r>
+      <w:r>
+        <w:t xml:space="preserve">, </w:t>
       </w:r>
       <w:r>
         <w:rPr>
-          <w:b/>
+          <w:rFonts w:ascii="Courier New" w:hAnsi="Courier New"/>
+          <w:sz w:val="18"/>
         </w:rPr>
-        <w:t>19 enabled tools</w:t>
-      </w:r>
-      <w:r>
-        <w:t>; discoverable tools need not appear as individual top-level model tools.</w:t>
+        <w:t>edit</w:t>
+      </w:r>
+      <w:r>
+        <w:t xml:space="preserve">, </w:t>
+      </w:r>
+      <w:r>
+        <w:rPr>
+          <w:rFonts w:ascii="Courier New" w:hAnsi="Courier New"/>
+          <w:sz w:val="18"/>
+        </w:rPr>
+        <w:t>eval</w:t>
+      </w:r>
+      <w:r>
+        <w:t xml:space="preserve">, </w:t>
+      </w:r>
+      <w:r>
+        <w:rPr>
+          <w:rFonts w:ascii="Courier New" w:hAnsi="Courier New"/>
+          <w:sz w:val="18"/>
+        </w:rPr>
+        <w:t>glob</w:t>
+      </w:r>
+      <w:r>
+        <w:t xml:space="preserve">, </w:t>
+      </w:r>
+      <w:r>
+        <w:rPr>
+          <w:rFonts w:ascii="Courier New" w:hAnsi="Courier New"/>
+          <w:sz w:val="18"/>
+        </w:rPr>
+        <w:t>grep</w:t>
+      </w:r>
+      <w:r>
+        <w:t xml:space="preserve">, </w:t>
+      </w:r>
+      <w:r>
+        <w:rPr>
+          <w:rFonts w:ascii="Courier New" w:hAnsi="Courier New"/>
+          <w:sz w:val="18"/>
+        </w:rPr>
+        <w:t>task</w:t>
+      </w:r>
+      <w:r>
+        <w:t xml:space="preserve">, </w:t>
+      </w:r>
+      <w:r>
+        <w:rPr>
+          <w:rFonts w:ascii="Courier New" w:hAnsi="Courier New"/>
+          <w:sz w:val="18"/>
+        </w:rPr>
+        <w:t>wait</w:t>
+      </w:r>
+      <w:r>
+        <w:t xml:space="preserve">, </w:t>
+      </w:r>
+      <w:r>
+        <w:rPr>
+          <w:rFonts w:ascii="Courier New" w:hAnsi="Courier New"/>
+          <w:sz w:val="18"/>
+        </w:rPr>
+        <w:t>todo</w:t>
+      </w:r>
+      <w:r>
+        <w:t xml:space="preserve">, </w:t>
+      </w:r>
+      <w:r>
+        <w:rPr>
+          <w:rFonts w:ascii="Courier New" w:hAnsi="Courier New"/>
+          <w:sz w:val="18"/>
+        </w:rPr>
+        <w:t>web_search</w:t>
+      </w:r>
+      <w:r>
+        <w:t xml:space="preserve"> and </w:t>
+      </w:r>
+      <w:r>
+        <w:rPr>
+          <w:rFonts w:ascii="Courier New" w:hAnsi="Courier New"/>
+          <w:sz w:val="18"/>
+        </w:rPr>
+        <w:t>write</w:t>
+      </w:r>
+      <w:r>
+        <w:t>. Kiln registers its own tools through the operator extension. Discoverable tools need not appear as individual top-level model tools; the historical tool count from 18.1.14 is not a current inventory.</w:t>
       </w:r>
     </w:p>
     <w:tbl>
@@ -2143,7 +2284,7 @@
                 <w:b w:val="0"/>
                 <w:sz w:val="18"/>
               </w:rPr>
-              <w:t>hub</w:t>
+              <w:t>wait</w:t>
             </w:r>
             <w:r>
               <w:rPr>
@@ -2159,6 +2300,36 @@
                 <w:sz w:val="18"/>
               </w:rPr>
               <w:t>todo</w:t>
+            </w:r>
+            <w:r>
+              <w:rPr>
+                <w:b w:val="0"/>
+                <w:sz w:val="18"/>
+              </w:rPr>
+              <w:t xml:space="preserve">; </w:t>
+            </w:r>
+            <w:r>
+              <w:rPr>
+                <w:rFonts w:ascii="Courier New" w:hAnsi="Courier New"/>
+                <w:b w:val="0"/>
+                <w:sz w:val="18"/>
+              </w:rPr>
+              <w:t>write</w:t>
+            </w:r>
+            <w:r>
+              <w:rPr>
+                <w:b w:val="0"/>
+                <w:sz w:val="18"/>
+              </w:rPr>
+              <w:t xml:space="preserve"> to </w:t>
+            </w:r>
+            <w:r>
+              <w:rPr>
+                <w:rFonts w:ascii="Courier New" w:hAnsi="Courier New"/>
+                <w:b w:val="0"/>
+                <w:sz w:val="18"/>
+              </w:rPr>
+              <w:t>agent://&lt;id&gt;</w:t>
             </w:r>
           </w:p>
         </w:tc>
@@ -2183,7 +2354,7 @@
                 <w:b w:val="0"/>
                 <w:sz w:val="18"/>
               </w:rPr>
-              <w:t>Native workers, messages/processes, task tracking</w:t>
+              <w:t>Native workers, waiting for owned jobs/messages, task tracking and peer messages</w:t>
             </w:r>
           </w:p>
         </w:tc>
@@ -2265,102 +2436,6 @@
                 <w:sz w:val="18"/>
               </w:rPr>
               <w:t>Search access subject to the configured provider/environment</w:t>
-            </w:r>
-          </w:p>
-        </w:tc>
-      </w:tr>
-      <w:tr>
-        <w:trPr>
-          <w:cantSplit/>
-        </w:trPr>
-        <w:tc>
-          <w:tcPr>
-            <w:tcW w:type="dxa" w:w="1872"/>
-            <w:vAlign w:val="center"/>
-            <w:shd w:fill="FFFFFF"/>
-            <w:tcMar>
-              <w:top w:w="90" w:type="dxa"/>
-              <w:left w:w="90" w:type="dxa"/>
-              <w:bottom w:w="90" w:type="dxa"/>
-              <w:right w:w="90" w:type="dxa"/>
-            </w:tcMar>
-          </w:tcPr>
-          <w:p>
-            <w:pPr>
-              <w:spacing w:after="40"/>
-            </w:pPr>
-            <w:r>
-              <w:rPr>
-                <w:b w:val="0"/>
-                <w:sz w:val="18"/>
-              </w:rPr>
-              <w:t>Discoverable native</w:t>
-            </w:r>
-          </w:p>
-        </w:tc>
-        <w:tc>
-          <w:tcPr>
-            <w:tcW w:type="dxa" w:w="3888"/>
-            <w:vAlign w:val="center"/>
-            <w:shd w:fill="FFFFFF"/>
-            <w:tcMar>
-              <w:top w:w="90" w:type="dxa"/>
-              <w:left w:w="90" w:type="dxa"/>
-              <w:bottom w:w="90" w:type="dxa"/>
-              <w:right w:w="90" w:type="dxa"/>
-            </w:tcMar>
-          </w:tcPr>
-          <w:p>
-            <w:pPr>
-              <w:spacing w:after="40"/>
-            </w:pPr>
-            <w:r>
-              <w:rPr>
-                <w:rFonts w:ascii="Courier New" w:hAnsi="Courier New"/>
-                <w:b w:val="0"/>
-                <w:sz w:val="18"/>
-              </w:rPr>
-              <w:t>ast_edit</w:t>
-            </w:r>
-            <w:r>
-              <w:rPr>
-                <w:b w:val="0"/>
-                <w:sz w:val="18"/>
-              </w:rPr>
-              <w:t xml:space="preserve">, </w:t>
-            </w:r>
-            <w:r>
-              <w:rPr>
-                <w:rFonts w:ascii="Courier New" w:hAnsi="Courier New"/>
-                <w:b w:val="0"/>
-                <w:sz w:val="18"/>
-              </w:rPr>
-              <w:t>debug</w:t>
-            </w:r>
-          </w:p>
-        </w:tc>
-        <w:tc>
-          <w:tcPr>
-            <w:tcW w:type="dxa" w:w="4320"/>
-            <w:vAlign w:val="center"/>
-            <w:shd w:fill="FFFFFF"/>
-            <w:tcMar>
-              <w:top w:w="90" w:type="dxa"/>
-              <w:left w:w="90" w:type="dxa"/>
-              <w:bottom w:w="90" w:type="dxa"/>
-              <w:right w:w="90" w:type="dxa"/>
-            </w:tcMar>
-          </w:tcPr>
-          <w:p>
-            <w:pPr>
-              <w:spacing w:after="40"/>
-            </w:pPr>
-            <w:r>
-              <w:rPr>
-                <w:b w:val="0"/>
-                <w:sz w:val="18"/>
-              </w:rPr>
-              <w:t>Structural editing and debugging</w:t>
             </w:r>
           </w:p>
         </w:tc>
@@ -2529,6 +2604,48 @@
     </w:p>
     <w:p>
       <w:r>
+        <w:rPr>
+          <w:rFonts w:ascii="Courier New" w:hAnsi="Courier New"/>
+          <w:sz w:val="18"/>
+        </w:rPr>
+        <w:t>hub</w:t>
+      </w:r>
+      <w:r>
+        <w:t xml:space="preserve"> was removed upstream. Native task results and messages are delivered automatically; agents use </w:t>
+      </w:r>
+      <w:r>
+        <w:rPr>
+          <w:rFonts w:ascii="Courier New" w:hAnsi="Courier New"/>
+          <w:sz w:val="18"/>
+        </w:rPr>
+        <w:t>write</w:t>
+      </w:r>
+      <w:r>
+        <w:t xml:space="preserve"> to </w:t>
+      </w:r>
+      <w:r>
+        <w:rPr>
+          <w:rFonts w:ascii="Courier New" w:hAnsi="Courier New"/>
+          <w:sz w:val="18"/>
+        </w:rPr>
+        <w:t>agent://&lt;id&gt;</w:t>
+      </w:r>
+      <w:r>
+        <w:t xml:space="preserve"> for peer messages and call </w:t>
+      </w:r>
+      <w:r>
+        <w:rPr>
+          <w:rFonts w:ascii="Courier New" w:hAnsi="Courier New"/>
+          <w:sz w:val="18"/>
+        </w:rPr>
+        <w:t>wait</w:t>
+      </w:r>
+      <w:r>
+        <w:t xml:space="preserve"> only when blocked. This is not a one-for-one replacement for every old hub operation. Native child-session, metering and cancellation tests exercise the pinned runtime; they do not establish external provider readiness.</w:t>
+      </w:r>
+    </w:p>
+    <w:p>
+      <w:r>
         <w:t xml:space="preserve">The built-in Chromium browser capability is enabled through the </w:t>
       </w:r>
       <w:r>
@@ -2830,7 +2947,7 @@
             <w:pPr>
               <w:spacing w:after="40"/>
             </w:pPr>
-            <w:hyperlink r:id="rId16">
+            <w:hyperlink r:id="rId17">
               <w:r>
                 <w:rPr>
                   <w:color w:val="1155AA"/>
@@ -2911,7 +3028,7 @@
             <w:pPr>
               <w:spacing w:after="40"/>
             </w:pPr>
-            <w:hyperlink r:id="rId17">
+            <w:hyperlink r:id="rId18">
               <w:r>
                 <w:rPr>
                   <w:color w:val="1155AA"/>
@@ -3037,7 +3154,7 @@
             <w:pPr>
               <w:spacing w:after="40"/>
             </w:pPr>
-            <w:hyperlink r:id="rId18">
+            <w:hyperlink r:id="rId19">
               <w:r>
                 <w:rPr>
                   <w:color w:val="1155AA"/>
@@ -3118,7 +3235,7 @@
             <w:pPr>
               <w:spacing w:after="40"/>
             </w:pPr>
-            <w:hyperlink r:id="rId19">
+            <w:hyperlink r:id="rId20">
               <w:r>
                 <w:rPr>
                   <w:color w:val="1155AA"/>
@@ -3197,7 +3314,7 @@
       <w:r>
         <w:t xml:space="preserve">Jev answers typed questions; it does not generate code or replace the main reasoning model. Kiln calls the </w:t>
       </w:r>
-      <w:hyperlink r:id="rId20">
+      <w:hyperlink r:id="rId21">
         <w:r>
           <w:rPr>
             <w:color w:val="1155AA"/>
@@ -3341,7 +3458,7 @@
       <w:r>
         <w:t xml:space="preserve">, verified on 2026-09-28 against </w:t>
       </w:r>
-      <w:hyperlink r:id="rId21">
+      <w:hyperlink r:id="rId22">
         <w:r>
           <w:rPr>
             <w:color w:val="1155AA"/>
@@ -3352,7 +3469,7 @@
       <w:r>
         <w:t xml:space="preserve">. Unknown usage retains the reservation. The reservation is conservative accounting, not a provider billing guarantee. Numeric calculations, budgets and date comparisons stay in code; the provider itself documents </w:t>
       </w:r>
-      <w:hyperlink r:id="rId22">
+      <w:hyperlink r:id="rId23">
         <w:r>
           <w:rPr>
             <w:color w:val="1155AA"/>
@@ -3480,7 +3597,7 @@
       <w:r>
         <w:t xml:space="preserve"> with its MIT license in </w:t>
       </w:r>
-      <w:hyperlink r:id="rId23">
+      <w:hyperlink r:id="rId24">
         <w:r>
           <w:rPr>
             <w:color w:val="1155AA"/>
@@ -3523,7 +3640,7 @@
       <w:r>
         <w:t xml:space="preserve"> call. Hindsight retention remains independent and explicit. See </w:t>
       </w:r>
-      <w:hyperlink r:id="rId24">
+      <w:hyperlink r:id="rId25">
         <w:r>
           <w:rPr>
             <w:color w:val="1155AA"/>
@@ -3537,7 +3654,18 @@
     </w:p>
     <w:p>
       <w:r>
-        <w:t>Enabled workflow decisions send scoped browser observations/tasks or research passages/questions to TypeSafe. The implementation is exercised offline; no live Jev performance result is established because no TypeSafe key was configured during qualification. This avoids claiming each cheap decision displaced a frontier call without a matched baseline.</w:t>
+        <w:t xml:space="preserve">Enabled workflow decisions send scoped browser observations/tasks or research passages/questions to TypeSafe. Offline contracts are supplemented by a </w:t>
+      </w:r>
+      <w:hyperlink r:id="rId11">
+        <w:r>
+          <w:rPr>
+            <w:color w:val="1155AA"/>
+          </w:rPr>
+          <w:t>nine-request live qualification</w:t>
+        </w:r>
+      </w:hyperlink>
+      <w:r>
+        <w:t>: three synthetic fixtures passed, with 3,733 input and 487 output tokens. Adapter-price cost was calculated as $0.000156786, not verified against an invoice. This confirms those live classification/batching/reuse cases; it does not establish representative task accuracy or a frontier-model throughput advantage. A separate native form fixture subsequently produced a verified specified-check receipt with two Jev decisions, 1,328 input and 158 output tokens, after five incomplete calibration attempts. Independent DOM inspection confirmed the field and greeting; this remains one development success, not held-out qualification.</w:t>
       </w:r>
     </w:p>
     <w:p>
@@ -3552,7 +3680,7 @@
       <w:r>
         <w:t xml:space="preserve">The adapter follows the </w:t>
       </w:r>
-      <w:hyperlink r:id="rId25">
+      <w:hyperlink r:id="rId26">
         <w:r>
           <w:rPr>
             <w:color w:val="1155AA"/>
@@ -3610,7 +3738,7 @@
       <w:r>
         <w:t xml:space="preserve">Hindsight is MIT-licensed software, but self-hosting still needs infrastructure/storage and model execution. Managed service billing is separate from Kiln's main model budget; consult </w:t>
       </w:r>
-      <w:hyperlink r:id="rId26">
+      <w:hyperlink r:id="rId27">
         <w:r>
           <w:rPr>
             <w:color w:val="1155AA"/>
@@ -3679,7 +3807,7 @@
       <w:r>
         <w:t xml:space="preserve"> inspects upstream package versions without applying them. The </w:t>
       </w:r>
-      <w:hyperlink r:id="rId12">
+      <w:hyperlink r:id="rId13">
         <w:r>
           <w:rPr>
             <w:color w:val="1155AA"/>
@@ -3690,7 +3818,7 @@
       <w:r>
         <w:t xml:space="preserve"> selects the latest common stable version of the six pinned native packages and prepares a validated exact-version update as a draft pull request. It needs to be merged and enabled before its schedule operates; it does not auto-merge, change benchmark rankings or hot-swap a running session. The validation path includes patch application, type checking, tests, evaluation verification and leak checks, plus advisory catalog inspection. Publishing occurs in a separate job so upgraded code does not execute with the write token. See </w:t>
       </w:r>
-      <w:hyperlink r:id="rId13">
+      <w:hyperlink r:id="rId14">
         <w:r>
           <w:rPr>
             <w:color w:val="1155AA"/>
@@ -3719,7 +3847,7 @@
       <w:r>
         <w:t xml:space="preserve">See </w:t>
       </w:r>
-      <w:hyperlink r:id="rId27">
+      <w:hyperlink r:id="rId28">
         <w:r>
           <w:rPr>
             <w:color w:val="1155AA"/>
@@ -4126,7 +4254,7 @@
     <w:qFormat/>
     <w:rsid w:val="00FC693F"/>
     <w:pPr>
-      <w:spacing w:after="100" w:line="252" w:lineRule="auto"/>
+      <w:spacing w:after="80" w:line="252" w:lineRule="auto"/>
     </w:pPr>
     <w:rPr>
       <w:rFonts w:ascii="Arial" w:hAnsi="Arial"/>

</xml_diff>